<commit_message>
(One of the) final uploads!
</commit_message>
<xml_diff>
--- a/output/EDLD640 handout v3 2026.3. Policy Brief fancy draft HM.docx
+++ b/output/EDLD640 handout v3 2026.3. Policy Brief fancy draft HM.docx
@@ -232,13 +232,7 @@
         <w:t xml:space="preserve">Recent data from Office of Special Education Programs (2025) revealed that Black and American Indian/Alaska Native families and their children have been disproportionately removed from EI services at much higher rates compared to White and Asian families. </w:t>
       </w:r>
       <w:r>
-        <w:t>This nine-year analysis across all 50 states documents these disparities and their</w:t>
-      </w:r>
-      <w:r>
-        <w:t xml:space="preserve"> potential</w:t>
-      </w:r>
-      <w:r>
-        <w:t xml:space="preserve"> origins.</w:t>
+        <w:t>This nine-year analysis across all 50 states documents these disparities and their potential origins.</w:t>
       </w:r>
     </w:p>
     <w:p>
@@ -282,19 +276,7 @@
         <w:t xml:space="preserve"> </w:t>
       </w:r>
       <w:r>
-        <w:t xml:space="preserve">EI </w:t>
-      </w:r>
-      <w:r>
-        <w:t>serves infants and toddlers (birth to age 3) with disabilities or developmental delays. Children exit EI through different pathways</w:t>
-      </w:r>
-      <w:r>
-        <w:t xml:space="preserve">, </w:t>
-      </w:r>
-      <w:r>
-        <w:t>dismissed for lost contact, moved out, not determined, not eligible, Part B eligible, or withdrawn. Disparities in these exit patterns reveal underlying inequities</w:t>
-      </w:r>
-      <w:r>
-        <w:t xml:space="preserve"> in engagement patterns. </w:t>
+        <w:t xml:space="preserve">EI serves infants and toddlers (birth to age 3) with disabilities or developmental delays. Children exit EI through different pathways, dismissed for lost contact, moved out, not determined, not eligible, Part B eligible, or withdrawn. Disparities in these exit patterns reveal underlying inequities in engagement patterns. </w:t>
       </w:r>
     </w:p>
     <w:p>
@@ -3221,6 +3203,666 @@
         <w:pStyle w:val="font-claude-response-body"/>
         <w:spacing w:before="0" w:beforeAutospacing="0" w:after="0" w:afterAutospacing="0"/>
         <w:rPr>
+          <w:rStyle w:val="Strong"/>
+          <w:rFonts w:eastAsiaTheme="majorEastAsia"/>
+          <w:b w:val="0"/>
+          <w:bCs w:val="0"/>
+          <w:color w:val="156082" w:themeColor="accent1"/>
+        </w:rPr>
+      </w:pPr>
+      <w:r>
+        <w:rPr>
+          <w:rStyle w:val="Strong"/>
+          <w:rFonts w:eastAsiaTheme="majorEastAsia"/>
+          <w:color w:val="156082" w:themeColor="accent1"/>
+        </w:rPr>
+        <w:t xml:space="preserve">Summary: </w:t>
+      </w:r>
+    </w:p>
+    <w:p>
+      <w:pPr>
+        <w:pStyle w:val="font-claude-response-body"/>
+        <w:numPr>
+          <w:ilvl w:val="0"/>
+          <w:numId w:val="14"/>
+        </w:numPr>
+        <w:spacing w:before="0" w:beforeAutospacing="0" w:after="0" w:afterAutospacing="0"/>
+        <w:rPr>
+          <w:rStyle w:val="Strong"/>
+          <w:rFonts w:eastAsiaTheme="majorEastAsia"/>
+          <w:color w:val="000000" w:themeColor="text1"/>
+        </w:rPr>
+      </w:pPr>
+      <w:r>
+        <w:rPr>
+          <w:rStyle w:val="Strong"/>
+          <w:rFonts w:eastAsiaTheme="majorEastAsia"/>
+          <w:color w:val="000000" w:themeColor="text1"/>
+        </w:rPr>
+        <w:t xml:space="preserve">Dismissed for Lost Contact: </w:t>
+      </w:r>
+    </w:p>
+    <w:p>
+      <w:pPr>
+        <w:pStyle w:val="font-claude-response-body"/>
+        <w:numPr>
+          <w:ilvl w:val="1"/>
+          <w:numId w:val="14"/>
+        </w:numPr>
+        <w:spacing w:before="0" w:beforeAutospacing="0" w:after="0" w:afterAutospacing="0"/>
+        <w:rPr>
+          <w:rStyle w:val="Strong"/>
+          <w:rFonts w:eastAsiaTheme="majorEastAsia"/>
+          <w:b w:val="0"/>
+          <w:bCs w:val="0"/>
+          <w:color w:val="000000" w:themeColor="text1"/>
+        </w:rPr>
+      </w:pPr>
+      <w:r>
+        <w:rPr>
+          <w:rStyle w:val="Strong"/>
+          <w:rFonts w:eastAsiaTheme="majorEastAsia"/>
+          <w:b w:val="0"/>
+          <w:bCs w:val="0"/>
+          <w:color w:val="000000" w:themeColor="text1"/>
+        </w:rPr>
+        <w:t>Highest: Black</w:t>
+      </w:r>
+      <w:r>
+        <w:rPr>
+          <w:rStyle w:val="Strong"/>
+          <w:rFonts w:eastAsiaTheme="majorEastAsia"/>
+          <w:b w:val="0"/>
+          <w:bCs w:val="0"/>
+          <w:color w:val="000000" w:themeColor="text1"/>
+        </w:rPr>
+        <w:t xml:space="preserve">: </w:t>
+      </w:r>
+      <w:r>
+        <w:rPr>
+          <w:rStyle w:val="Strong"/>
+          <w:rFonts w:eastAsiaTheme="majorEastAsia"/>
+          <w:b w:val="0"/>
+          <w:bCs w:val="0"/>
+          <w:color w:val="000000" w:themeColor="text1"/>
+        </w:rPr>
+        <w:t xml:space="preserve">28 states; </w:t>
+      </w:r>
+      <w:r>
+        <w:rPr>
+          <w:rStyle w:val="Strong"/>
+          <w:rFonts w:eastAsiaTheme="majorEastAsia"/>
+          <w:b w:val="0"/>
+          <w:bCs w:val="0"/>
+          <w:color w:val="000000" w:themeColor="text1"/>
+        </w:rPr>
+        <w:t>AI/AN</w:t>
+      </w:r>
+      <w:r>
+        <w:rPr>
+          <w:rStyle w:val="Strong"/>
+          <w:rFonts w:eastAsiaTheme="majorEastAsia"/>
+          <w:b w:val="0"/>
+          <w:bCs w:val="0"/>
+          <w:color w:val="000000" w:themeColor="text1"/>
+        </w:rPr>
+        <w:t>: 10 states</w:t>
+      </w:r>
+      <w:r>
+        <w:rPr>
+          <w:rStyle w:val="Strong"/>
+          <w:rFonts w:eastAsiaTheme="majorEastAsia"/>
+          <w:b w:val="0"/>
+          <w:bCs w:val="0"/>
+          <w:color w:val="000000" w:themeColor="text1"/>
+        </w:rPr>
+        <w:t xml:space="preserve">; </w:t>
+      </w:r>
+      <w:r>
+        <w:rPr>
+          <w:rStyle w:val="Strong"/>
+          <w:rFonts w:eastAsiaTheme="majorEastAsia"/>
+          <w:b w:val="0"/>
+          <w:bCs w:val="0"/>
+          <w:color w:val="000000" w:themeColor="text1"/>
+        </w:rPr>
+        <w:t xml:space="preserve">Hispanic: 7 states </w:t>
+      </w:r>
+    </w:p>
+    <w:p>
+      <w:pPr>
+        <w:pStyle w:val="font-claude-response-body"/>
+        <w:numPr>
+          <w:ilvl w:val="1"/>
+          <w:numId w:val="14"/>
+        </w:numPr>
+        <w:spacing w:before="0" w:beforeAutospacing="0" w:after="0" w:afterAutospacing="0"/>
+        <w:rPr>
+          <w:rStyle w:val="Strong"/>
+          <w:rFonts w:eastAsiaTheme="majorEastAsia"/>
+          <w:b w:val="0"/>
+          <w:bCs w:val="0"/>
+          <w:color w:val="000000" w:themeColor="text1"/>
+        </w:rPr>
+      </w:pPr>
+      <w:r>
+        <w:rPr>
+          <w:rStyle w:val="Strong"/>
+          <w:rFonts w:eastAsiaTheme="majorEastAsia"/>
+          <w:b w:val="0"/>
+          <w:bCs w:val="0"/>
+          <w:color w:val="000000" w:themeColor="text1"/>
+        </w:rPr>
+        <w:t>Lowest: White: 31 states; Asian: 17 states</w:t>
+      </w:r>
+    </w:p>
+    <w:p>
+      <w:pPr>
+        <w:pStyle w:val="font-claude-response-body"/>
+        <w:numPr>
+          <w:ilvl w:val="0"/>
+          <w:numId w:val="14"/>
+        </w:numPr>
+        <w:spacing w:before="0" w:beforeAutospacing="0" w:after="0" w:afterAutospacing="0"/>
+        <w:rPr>
+          <w:rStyle w:val="Strong"/>
+          <w:rFonts w:eastAsiaTheme="majorEastAsia"/>
+          <w:color w:val="000000" w:themeColor="text1"/>
+        </w:rPr>
+      </w:pPr>
+      <w:r>
+        <w:rPr>
+          <w:rStyle w:val="Strong"/>
+          <w:rFonts w:eastAsiaTheme="majorEastAsia"/>
+          <w:color w:val="000000" w:themeColor="text1"/>
+        </w:rPr>
+        <w:t xml:space="preserve">Moved Out: </w:t>
+      </w:r>
+    </w:p>
+    <w:p>
+      <w:pPr>
+        <w:pStyle w:val="font-claude-response-body"/>
+        <w:numPr>
+          <w:ilvl w:val="1"/>
+          <w:numId w:val="14"/>
+        </w:numPr>
+        <w:spacing w:before="0" w:beforeAutospacing="0" w:after="0" w:afterAutospacing="0"/>
+        <w:rPr>
+          <w:rStyle w:val="Strong"/>
+          <w:rFonts w:eastAsiaTheme="majorEastAsia"/>
+          <w:b w:val="0"/>
+          <w:bCs w:val="0"/>
+          <w:color w:val="000000" w:themeColor="text1"/>
+        </w:rPr>
+      </w:pPr>
+      <w:r>
+        <w:rPr>
+          <w:rStyle w:val="Strong"/>
+          <w:rFonts w:eastAsiaTheme="majorEastAsia"/>
+          <w:b w:val="0"/>
+          <w:bCs w:val="0"/>
+          <w:color w:val="000000" w:themeColor="text1"/>
+        </w:rPr>
+        <w:t xml:space="preserve">Highest: Asian: 30 states; </w:t>
+      </w:r>
+      <w:r>
+        <w:rPr>
+          <w:rStyle w:val="Strong"/>
+          <w:rFonts w:eastAsiaTheme="majorEastAsia"/>
+          <w:b w:val="0"/>
+          <w:bCs w:val="0"/>
+          <w:color w:val="000000" w:themeColor="text1"/>
+        </w:rPr>
+        <w:t>PI</w:t>
+      </w:r>
+      <w:r>
+        <w:rPr>
+          <w:rStyle w:val="Strong"/>
+          <w:rFonts w:eastAsiaTheme="majorEastAsia"/>
+          <w:b w:val="0"/>
+          <w:bCs w:val="0"/>
+          <w:color w:val="000000" w:themeColor="text1"/>
+        </w:rPr>
+        <w:t xml:space="preserve">: 8 states; White: 6 states </w:t>
+      </w:r>
+    </w:p>
+    <w:p>
+      <w:pPr>
+        <w:pStyle w:val="font-claude-response-body"/>
+        <w:numPr>
+          <w:ilvl w:val="1"/>
+          <w:numId w:val="14"/>
+        </w:numPr>
+        <w:spacing w:before="0" w:beforeAutospacing="0" w:after="0" w:afterAutospacing="0"/>
+        <w:rPr>
+          <w:rStyle w:val="Strong"/>
+          <w:rFonts w:eastAsiaTheme="majorEastAsia"/>
+          <w:b w:val="0"/>
+          <w:bCs w:val="0"/>
+          <w:color w:val="000000" w:themeColor="text1"/>
+        </w:rPr>
+      </w:pPr>
+      <w:r>
+        <w:rPr>
+          <w:rStyle w:val="Strong"/>
+          <w:rFonts w:eastAsiaTheme="majorEastAsia"/>
+          <w:b w:val="0"/>
+          <w:bCs w:val="0"/>
+          <w:color w:val="000000" w:themeColor="text1"/>
+        </w:rPr>
+        <w:t xml:space="preserve">Lowest: White: 16 states; Hispanic: 12 states; Black: 11 states </w:t>
+      </w:r>
+    </w:p>
+    <w:p>
+      <w:pPr>
+        <w:pStyle w:val="font-claude-response-body"/>
+        <w:numPr>
+          <w:ilvl w:val="0"/>
+          <w:numId w:val="14"/>
+        </w:numPr>
+        <w:spacing w:before="0" w:beforeAutospacing="0" w:after="0" w:afterAutospacing="0"/>
+        <w:rPr>
+          <w:rStyle w:val="Strong"/>
+          <w:rFonts w:eastAsiaTheme="majorEastAsia"/>
+          <w:color w:val="000000" w:themeColor="text1"/>
+        </w:rPr>
+      </w:pPr>
+      <w:r>
+        <w:rPr>
+          <w:rStyle w:val="Strong"/>
+          <w:rFonts w:eastAsiaTheme="majorEastAsia"/>
+          <w:color w:val="000000" w:themeColor="text1"/>
+        </w:rPr>
+        <w:t xml:space="preserve">Not Determined: </w:t>
+      </w:r>
+    </w:p>
+    <w:p>
+      <w:pPr>
+        <w:pStyle w:val="font-claude-response-body"/>
+        <w:numPr>
+          <w:ilvl w:val="1"/>
+          <w:numId w:val="14"/>
+        </w:numPr>
+        <w:spacing w:before="0" w:beforeAutospacing="0" w:after="0" w:afterAutospacing="0"/>
+        <w:rPr>
+          <w:rStyle w:val="Strong"/>
+          <w:rFonts w:eastAsiaTheme="majorEastAsia"/>
+          <w:b w:val="0"/>
+          <w:bCs w:val="0"/>
+          <w:color w:val="000000" w:themeColor="text1"/>
+        </w:rPr>
+      </w:pPr>
+      <w:r>
+        <w:rPr>
+          <w:rStyle w:val="Strong"/>
+          <w:rFonts w:eastAsiaTheme="majorEastAsia"/>
+          <w:b w:val="0"/>
+          <w:bCs w:val="0"/>
+          <w:color w:val="000000" w:themeColor="text1"/>
+        </w:rPr>
+        <w:t xml:space="preserve">Highest: Black: 24 states; Hispanic: 14 states; </w:t>
+      </w:r>
+      <w:r>
+        <w:rPr>
+          <w:rStyle w:val="Strong"/>
+          <w:rFonts w:eastAsiaTheme="majorEastAsia"/>
+          <w:b w:val="0"/>
+          <w:bCs w:val="0"/>
+          <w:color w:val="000000" w:themeColor="text1"/>
+        </w:rPr>
+        <w:t>AI/AN</w:t>
+      </w:r>
+      <w:r>
+        <w:rPr>
+          <w:rStyle w:val="Strong"/>
+          <w:rFonts w:eastAsiaTheme="majorEastAsia"/>
+          <w:b w:val="0"/>
+          <w:bCs w:val="0"/>
+          <w:color w:val="000000" w:themeColor="text1"/>
+        </w:rPr>
+        <w:t xml:space="preserve">: 4 states </w:t>
+      </w:r>
+    </w:p>
+    <w:p>
+      <w:pPr>
+        <w:pStyle w:val="font-claude-response-body"/>
+        <w:numPr>
+          <w:ilvl w:val="1"/>
+          <w:numId w:val="14"/>
+        </w:numPr>
+        <w:spacing w:before="0" w:beforeAutospacing="0" w:after="0" w:afterAutospacing="0"/>
+        <w:rPr>
+          <w:rStyle w:val="Strong"/>
+          <w:rFonts w:eastAsiaTheme="majorEastAsia"/>
+          <w:b w:val="0"/>
+          <w:bCs w:val="0"/>
+          <w:color w:val="000000" w:themeColor="text1"/>
+        </w:rPr>
+      </w:pPr>
+      <w:r>
+        <w:rPr>
+          <w:rStyle w:val="Strong"/>
+          <w:rFonts w:eastAsiaTheme="majorEastAsia"/>
+          <w:b w:val="0"/>
+          <w:bCs w:val="0"/>
+          <w:color w:val="000000" w:themeColor="text1"/>
+        </w:rPr>
+        <w:t xml:space="preserve">Lowest: White: 25 states; </w:t>
+      </w:r>
+      <w:r>
+        <w:rPr>
+          <w:rStyle w:val="Strong"/>
+          <w:rFonts w:eastAsiaTheme="majorEastAsia"/>
+          <w:b w:val="0"/>
+          <w:bCs w:val="0"/>
+          <w:color w:val="000000" w:themeColor="text1"/>
+        </w:rPr>
+        <w:t>PI</w:t>
+      </w:r>
+      <w:r>
+        <w:rPr>
+          <w:rStyle w:val="Strong"/>
+          <w:rFonts w:eastAsiaTheme="majorEastAsia"/>
+          <w:b w:val="0"/>
+          <w:bCs w:val="0"/>
+          <w:color w:val="000000" w:themeColor="text1"/>
+        </w:rPr>
+        <w:t xml:space="preserve">: 8 states </w:t>
+      </w:r>
+    </w:p>
+    <w:p>
+      <w:pPr>
+        <w:pStyle w:val="font-claude-response-body"/>
+        <w:numPr>
+          <w:ilvl w:val="0"/>
+          <w:numId w:val="14"/>
+        </w:numPr>
+        <w:spacing w:before="0" w:beforeAutospacing="0" w:after="0" w:afterAutospacing="0"/>
+        <w:rPr>
+          <w:rStyle w:val="Strong"/>
+          <w:rFonts w:eastAsiaTheme="majorEastAsia"/>
+          <w:color w:val="000000" w:themeColor="text1"/>
+        </w:rPr>
+      </w:pPr>
+      <w:r>
+        <w:rPr>
+          <w:rStyle w:val="Strong"/>
+          <w:rFonts w:eastAsiaTheme="majorEastAsia"/>
+          <w:color w:val="000000" w:themeColor="text1"/>
+        </w:rPr>
+        <w:t>Not Eligible</w:t>
+      </w:r>
+      <w:r>
+        <w:rPr>
+          <w:rStyle w:val="Strong"/>
+          <w:rFonts w:eastAsiaTheme="majorEastAsia"/>
+          <w:color w:val="000000" w:themeColor="text1"/>
+        </w:rPr>
+        <w:t>:</w:t>
+      </w:r>
+    </w:p>
+    <w:p>
+      <w:pPr>
+        <w:pStyle w:val="font-claude-response-body"/>
+        <w:numPr>
+          <w:ilvl w:val="1"/>
+          <w:numId w:val="14"/>
+        </w:numPr>
+        <w:spacing w:before="0" w:beforeAutospacing="0" w:after="0" w:afterAutospacing="0"/>
+        <w:rPr>
+          <w:rStyle w:val="Strong"/>
+          <w:rFonts w:eastAsiaTheme="majorEastAsia"/>
+          <w:b w:val="0"/>
+          <w:bCs w:val="0"/>
+          <w:color w:val="000000" w:themeColor="text1"/>
+        </w:rPr>
+      </w:pPr>
+      <w:r>
+        <w:rPr>
+          <w:rStyle w:val="Strong"/>
+          <w:rFonts w:eastAsiaTheme="majorEastAsia"/>
+          <w:b w:val="0"/>
+          <w:bCs w:val="0"/>
+          <w:color w:val="000000" w:themeColor="text1"/>
+        </w:rPr>
+        <w:t xml:space="preserve">Highest: White: </w:t>
+      </w:r>
+      <w:r>
+        <w:rPr>
+          <w:rStyle w:val="Strong"/>
+          <w:rFonts w:eastAsiaTheme="majorEastAsia"/>
+          <w:b w:val="0"/>
+          <w:bCs w:val="0"/>
+          <w:color w:val="000000" w:themeColor="text1"/>
+        </w:rPr>
+        <w:t>39 states</w:t>
+      </w:r>
+      <w:r>
+        <w:rPr>
+          <w:rStyle w:val="Strong"/>
+          <w:rFonts w:eastAsiaTheme="majorEastAsia"/>
+          <w:b w:val="0"/>
+          <w:bCs w:val="0"/>
+          <w:color w:val="000000" w:themeColor="text1"/>
+        </w:rPr>
+        <w:t xml:space="preserve">; PI: 6 states; AI/AN: 5 states </w:t>
+      </w:r>
+    </w:p>
+    <w:p>
+      <w:pPr>
+        <w:pStyle w:val="font-claude-response-body"/>
+        <w:numPr>
+          <w:ilvl w:val="1"/>
+          <w:numId w:val="14"/>
+        </w:numPr>
+        <w:spacing w:before="0" w:beforeAutospacing="0" w:after="0" w:afterAutospacing="0"/>
+        <w:rPr>
+          <w:rStyle w:val="Strong"/>
+          <w:rFonts w:eastAsiaTheme="majorEastAsia"/>
+          <w:b w:val="0"/>
+          <w:bCs w:val="0"/>
+          <w:color w:val="000000" w:themeColor="text1"/>
+        </w:rPr>
+      </w:pPr>
+      <w:r>
+        <w:rPr>
+          <w:rStyle w:val="Strong"/>
+          <w:rFonts w:eastAsiaTheme="majorEastAsia"/>
+          <w:b w:val="0"/>
+          <w:bCs w:val="0"/>
+          <w:color w:val="000000" w:themeColor="text1"/>
+        </w:rPr>
+        <w:t xml:space="preserve">Lowest: Black: 26 states; PI: 12 states </w:t>
+      </w:r>
+    </w:p>
+    <w:p>
+      <w:pPr>
+        <w:pStyle w:val="font-claude-response-body"/>
+        <w:numPr>
+          <w:ilvl w:val="0"/>
+          <w:numId w:val="14"/>
+        </w:numPr>
+        <w:spacing w:before="0" w:beforeAutospacing="0" w:after="0" w:afterAutospacing="0"/>
+        <w:rPr>
+          <w:rStyle w:val="Strong"/>
+          <w:rFonts w:eastAsiaTheme="majorEastAsia"/>
+          <w:color w:val="000000" w:themeColor="text1"/>
+        </w:rPr>
+      </w:pPr>
+      <w:r>
+        <w:rPr>
+          <w:rStyle w:val="Strong"/>
+          <w:rFonts w:eastAsiaTheme="majorEastAsia"/>
+          <w:color w:val="000000" w:themeColor="text1"/>
+        </w:rPr>
+        <w:t xml:space="preserve">Part B Eligible: </w:t>
+      </w:r>
+    </w:p>
+    <w:p>
+      <w:pPr>
+        <w:pStyle w:val="font-claude-response-body"/>
+        <w:numPr>
+          <w:ilvl w:val="1"/>
+          <w:numId w:val="14"/>
+        </w:numPr>
+        <w:spacing w:before="0" w:beforeAutospacing="0" w:after="0" w:afterAutospacing="0"/>
+        <w:rPr>
+          <w:rStyle w:val="Strong"/>
+          <w:rFonts w:eastAsiaTheme="majorEastAsia"/>
+          <w:b w:val="0"/>
+          <w:bCs w:val="0"/>
+          <w:color w:val="000000" w:themeColor="text1"/>
+        </w:rPr>
+      </w:pPr>
+      <w:r>
+        <w:rPr>
+          <w:rStyle w:val="Strong"/>
+          <w:rFonts w:eastAsiaTheme="majorEastAsia"/>
+          <w:b w:val="0"/>
+          <w:bCs w:val="0"/>
+          <w:color w:val="000000" w:themeColor="text1"/>
+        </w:rPr>
+        <w:t xml:space="preserve">Highest: AI/AN &amp; PI: 12 each; Hispanic, White, Asian 9 each </w:t>
+      </w:r>
+    </w:p>
+    <w:p>
+      <w:pPr>
+        <w:pStyle w:val="font-claude-response-body"/>
+        <w:numPr>
+          <w:ilvl w:val="1"/>
+          <w:numId w:val="14"/>
+        </w:numPr>
+        <w:spacing w:before="0" w:beforeAutospacing="0" w:after="0" w:afterAutospacing="0"/>
+        <w:rPr>
+          <w:rStyle w:val="Strong"/>
+          <w:rFonts w:eastAsiaTheme="majorEastAsia"/>
+          <w:b w:val="0"/>
+          <w:bCs w:val="0"/>
+          <w:color w:val="000000" w:themeColor="text1"/>
+        </w:rPr>
+      </w:pPr>
+      <w:r>
+        <w:rPr>
+          <w:rStyle w:val="Strong"/>
+          <w:rFonts w:eastAsiaTheme="majorEastAsia"/>
+          <w:b w:val="0"/>
+          <w:bCs w:val="0"/>
+          <w:color w:val="000000" w:themeColor="text1"/>
+        </w:rPr>
+        <w:t xml:space="preserve">Lowest: Black: 14 states; PI: 11 states. </w:t>
+      </w:r>
+      <w:r>
+        <w:rPr>
+          <w:rStyle w:val="Strong"/>
+          <w:rFonts w:eastAsiaTheme="majorEastAsia"/>
+        </w:rPr>
+        <w:t>Black or African American children are LEAST likely to transition to Part B in 14 states.</w:t>
+      </w:r>
+      <w:r>
+        <w:t xml:space="preserve"> This is the opposite of dismissed/not </w:t>
+      </w:r>
+      <w:proofErr w:type="gramStart"/>
+      <w:r>
+        <w:t>determined, and</w:t>
+      </w:r>
+      <w:proofErr w:type="gramEnd"/>
+      <w:r>
+        <w:t xml:space="preserve"> suggests they may be exiting EI through other pathways (dismissed, not determined) rather than successfully transitioning to school-age services.</w:t>
+      </w:r>
+    </w:p>
+    <w:p>
+      <w:pPr>
+        <w:pStyle w:val="font-claude-response-body"/>
+        <w:numPr>
+          <w:ilvl w:val="0"/>
+          <w:numId w:val="14"/>
+        </w:numPr>
+        <w:spacing w:before="0" w:beforeAutospacing="0" w:after="0" w:afterAutospacing="0"/>
+        <w:rPr>
+          <w:rStyle w:val="Strong"/>
+          <w:rFonts w:eastAsiaTheme="majorEastAsia"/>
+          <w:color w:val="000000" w:themeColor="text1"/>
+        </w:rPr>
+      </w:pPr>
+      <w:r>
+        <w:rPr>
+          <w:rStyle w:val="Strong"/>
+          <w:rFonts w:eastAsiaTheme="majorEastAsia"/>
+          <w:color w:val="000000" w:themeColor="text1"/>
+        </w:rPr>
+        <w:t xml:space="preserve">Withdrawn: </w:t>
+      </w:r>
+    </w:p>
+    <w:p>
+      <w:pPr>
+        <w:pStyle w:val="font-claude-response-body"/>
+        <w:numPr>
+          <w:ilvl w:val="1"/>
+          <w:numId w:val="14"/>
+        </w:numPr>
+        <w:spacing w:before="0" w:beforeAutospacing="0" w:after="0" w:afterAutospacing="0"/>
+        <w:rPr>
+          <w:rStyle w:val="Strong"/>
+          <w:rFonts w:eastAsiaTheme="majorEastAsia"/>
+          <w:b w:val="0"/>
+          <w:bCs w:val="0"/>
+          <w:color w:val="000000" w:themeColor="text1"/>
+        </w:rPr>
+      </w:pPr>
+      <w:r>
+        <w:rPr>
+          <w:rStyle w:val="Strong"/>
+          <w:rFonts w:eastAsiaTheme="majorEastAsia"/>
+          <w:b w:val="0"/>
+          <w:bCs w:val="0"/>
+          <w:color w:val="000000" w:themeColor="text1"/>
+        </w:rPr>
+        <w:t>Highest: Asian: 21 states; White: 18 states; PI: 7 states</w:t>
+      </w:r>
+    </w:p>
+    <w:p>
+      <w:pPr>
+        <w:pStyle w:val="font-claude-response-body"/>
+        <w:numPr>
+          <w:ilvl w:val="1"/>
+          <w:numId w:val="14"/>
+        </w:numPr>
+        <w:spacing w:before="0" w:beforeAutospacing="0" w:after="0" w:afterAutospacing="0"/>
+        <w:rPr>
+          <w:rStyle w:val="Strong"/>
+          <w:rFonts w:eastAsiaTheme="majorEastAsia"/>
+          <w:b w:val="0"/>
+          <w:bCs w:val="0"/>
+          <w:color w:val="000000" w:themeColor="text1"/>
+        </w:rPr>
+      </w:pPr>
+      <w:r>
+        <w:rPr>
+          <w:rStyle w:val="Strong"/>
+          <w:rFonts w:eastAsiaTheme="majorEastAsia"/>
+          <w:b w:val="0"/>
+          <w:bCs w:val="0"/>
+          <w:color w:val="000000" w:themeColor="text1"/>
+        </w:rPr>
+        <w:t xml:space="preserve">Lowest: AI/AN: 13 states; Black: 11 states; Hispanic: 11 states </w:t>
+      </w:r>
+    </w:p>
+    <w:p>
+      <w:pPr>
+        <w:pStyle w:val="font-claude-response-body"/>
+        <w:spacing w:before="0" w:beforeAutospacing="0" w:after="0" w:afterAutospacing="0"/>
+        <w:rPr>
+          <w:rStyle w:val="Strong"/>
+          <w:rFonts w:eastAsiaTheme="majorEastAsia"/>
+          <w:color w:val="156082" w:themeColor="accent1"/>
+        </w:rPr>
+      </w:pPr>
+    </w:p>
+    <w:p>
+      <w:pPr>
+        <w:pStyle w:val="font-claude-response-body"/>
+        <w:spacing w:before="0" w:beforeAutospacing="0" w:after="0" w:afterAutospacing="0"/>
+        <w:rPr>
           <w:color w:val="156082" w:themeColor="accent1"/>
         </w:rPr>
       </w:pPr>
@@ -3258,7 +3900,14 @@
           <w:rStyle w:val="Strong"/>
           <w:rFonts w:eastAsiaTheme="majorEastAsia"/>
         </w:rPr>
-        <w:t>38 states</w:t>
+        <w:t>2</w:t>
+      </w:r>
+      <w:r>
+        <w:rPr>
+          <w:rStyle w:val="Strong"/>
+          <w:rFonts w:eastAsiaTheme="majorEastAsia"/>
+        </w:rPr>
+        <w:t>8 states</w:t>
       </w:r>
       <w:r>
         <w:t>, "Dismissed for Lost Contact" shows the largest disparity</w:t>
@@ -3303,10 +3952,7 @@
         <w:t>real and consistent across years</w:t>
       </w:r>
       <w:r>
-        <w:t xml:space="preserve">, </w:t>
-      </w:r>
-      <w:r>
-        <w:t>driven by structural barriers like housing instability, transportation access, and language barriers</w:t>
+        <w:t>, driven by structural barriers like housing instability, transportation access, and language barriers</w:t>
       </w:r>
     </w:p>
     <w:p>
@@ -4840,6 +5486,118 @@
     </w:lvl>
   </w:abstractNum>
   <w:abstractNum w:abstractNumId="6" w15:restartNumberingAfterBreak="0">
+    <w:nsid w:val="38246E0F"/>
+    <w:multiLevelType w:val="hybridMultilevel"/>
+    <w:tmpl w:val="39F28BD6"/>
+    <w:lvl w:ilvl="0" w:tplc="90E2AD56">
+      <w:numFmt w:val="bullet"/>
+      <w:lvlText w:val=""/>
+      <w:lvlJc w:val="left"/>
+      <w:pPr>
+        <w:ind w:left="720" w:hanging="360"/>
+      </w:pPr>
+      <w:rPr>
+        <w:rFonts w:ascii="Symbol" w:eastAsiaTheme="majorEastAsia" w:hAnsi="Symbol" w:cs="Times New Roman" w:hint="default"/>
+      </w:rPr>
+    </w:lvl>
+    <w:lvl w:ilvl="1" w:tplc="04090003">
+      <w:start w:val="1"/>
+      <w:numFmt w:val="bullet"/>
+      <w:lvlText w:val="o"/>
+      <w:lvlJc w:val="left"/>
+      <w:pPr>
+        <w:ind w:left="1440" w:hanging="360"/>
+      </w:pPr>
+      <w:rPr>
+        <w:rFonts w:ascii="Courier New" w:hAnsi="Courier New" w:cs="Courier New" w:hint="default"/>
+      </w:rPr>
+    </w:lvl>
+    <w:lvl w:ilvl="2" w:tplc="04090005" w:tentative="1">
+      <w:start w:val="1"/>
+      <w:numFmt w:val="bullet"/>
+      <w:lvlText w:val=""/>
+      <w:lvlJc w:val="left"/>
+      <w:pPr>
+        <w:ind w:left="2160" w:hanging="360"/>
+      </w:pPr>
+      <w:rPr>
+        <w:rFonts w:ascii="Wingdings" w:hAnsi="Wingdings" w:hint="default"/>
+      </w:rPr>
+    </w:lvl>
+    <w:lvl w:ilvl="3" w:tplc="04090001" w:tentative="1">
+      <w:start w:val="1"/>
+      <w:numFmt w:val="bullet"/>
+      <w:lvlText w:val=""/>
+      <w:lvlJc w:val="left"/>
+      <w:pPr>
+        <w:ind w:left="2880" w:hanging="360"/>
+      </w:pPr>
+      <w:rPr>
+        <w:rFonts w:ascii="Symbol" w:hAnsi="Symbol" w:hint="default"/>
+      </w:rPr>
+    </w:lvl>
+    <w:lvl w:ilvl="4" w:tplc="04090003" w:tentative="1">
+      <w:start w:val="1"/>
+      <w:numFmt w:val="bullet"/>
+      <w:lvlText w:val="o"/>
+      <w:lvlJc w:val="left"/>
+      <w:pPr>
+        <w:ind w:left="3600" w:hanging="360"/>
+      </w:pPr>
+      <w:rPr>
+        <w:rFonts w:ascii="Courier New" w:hAnsi="Courier New" w:cs="Courier New" w:hint="default"/>
+      </w:rPr>
+    </w:lvl>
+    <w:lvl w:ilvl="5" w:tplc="04090005" w:tentative="1">
+      <w:start w:val="1"/>
+      <w:numFmt w:val="bullet"/>
+      <w:lvlText w:val=""/>
+      <w:lvlJc w:val="left"/>
+      <w:pPr>
+        <w:ind w:left="4320" w:hanging="360"/>
+      </w:pPr>
+      <w:rPr>
+        <w:rFonts w:ascii="Wingdings" w:hAnsi="Wingdings" w:hint="default"/>
+      </w:rPr>
+    </w:lvl>
+    <w:lvl w:ilvl="6" w:tplc="04090001" w:tentative="1">
+      <w:start w:val="1"/>
+      <w:numFmt w:val="bullet"/>
+      <w:lvlText w:val=""/>
+      <w:lvlJc w:val="left"/>
+      <w:pPr>
+        <w:ind w:left="5040" w:hanging="360"/>
+      </w:pPr>
+      <w:rPr>
+        <w:rFonts w:ascii="Symbol" w:hAnsi="Symbol" w:hint="default"/>
+      </w:rPr>
+    </w:lvl>
+    <w:lvl w:ilvl="7" w:tplc="04090003" w:tentative="1">
+      <w:start w:val="1"/>
+      <w:numFmt w:val="bullet"/>
+      <w:lvlText w:val="o"/>
+      <w:lvlJc w:val="left"/>
+      <w:pPr>
+        <w:ind w:left="5760" w:hanging="360"/>
+      </w:pPr>
+      <w:rPr>
+        <w:rFonts w:ascii="Courier New" w:hAnsi="Courier New" w:cs="Courier New" w:hint="default"/>
+      </w:rPr>
+    </w:lvl>
+    <w:lvl w:ilvl="8" w:tplc="04090005" w:tentative="1">
+      <w:start w:val="1"/>
+      <w:numFmt w:val="bullet"/>
+      <w:lvlText w:val=""/>
+      <w:lvlJc w:val="left"/>
+      <w:pPr>
+        <w:ind w:left="6480" w:hanging="360"/>
+      </w:pPr>
+      <w:rPr>
+        <w:rFonts w:ascii="Wingdings" w:hAnsi="Wingdings" w:hint="default"/>
+      </w:rPr>
+    </w:lvl>
+  </w:abstractNum>
+  <w:abstractNum w:abstractNumId="7" w15:restartNumberingAfterBreak="0">
     <w:nsid w:val="3F4A41B9"/>
     <w:multiLevelType w:val="multilevel"/>
     <w:tmpl w:val="4D2889D0"/>
@@ -4952,7 +5710,7 @@
       </w:rPr>
     </w:lvl>
   </w:abstractNum>
-  <w:abstractNum w:abstractNumId="7" w15:restartNumberingAfterBreak="0">
+  <w:abstractNum w:abstractNumId="8" w15:restartNumberingAfterBreak="0">
     <w:nsid w:val="456D2AAF"/>
     <w:multiLevelType w:val="multilevel"/>
     <w:tmpl w:val="80F6EB9A"/>
@@ -5101,7 +5859,7 @@
       </w:rPr>
     </w:lvl>
   </w:abstractNum>
-  <w:abstractNum w:abstractNumId="8" w15:restartNumberingAfterBreak="0">
+  <w:abstractNum w:abstractNumId="9" w15:restartNumberingAfterBreak="0">
     <w:nsid w:val="58160C90"/>
     <w:multiLevelType w:val="multilevel"/>
     <w:tmpl w:val="691CD8EC"/>
@@ -5250,7 +6008,7 @@
       </w:rPr>
     </w:lvl>
   </w:abstractNum>
-  <w:abstractNum w:abstractNumId="9" w15:restartNumberingAfterBreak="0">
+  <w:abstractNum w:abstractNumId="10" w15:restartNumberingAfterBreak="0">
     <w:nsid w:val="5E3E2CE3"/>
     <w:multiLevelType w:val="multilevel"/>
     <w:tmpl w:val="80B4F5DE"/>
@@ -5399,7 +6157,7 @@
       </w:rPr>
     </w:lvl>
   </w:abstractNum>
-  <w:abstractNum w:abstractNumId="10" w15:restartNumberingAfterBreak="0">
+  <w:abstractNum w:abstractNumId="11" w15:restartNumberingAfterBreak="0">
     <w:nsid w:val="63EE68DA"/>
     <w:multiLevelType w:val="multilevel"/>
     <w:tmpl w:val="6590CAE4"/>
@@ -5512,7 +6270,7 @@
       </w:rPr>
     </w:lvl>
   </w:abstractNum>
-  <w:abstractNum w:abstractNumId="11" w15:restartNumberingAfterBreak="0">
+  <w:abstractNum w:abstractNumId="12" w15:restartNumberingAfterBreak="0">
     <w:nsid w:val="79D650F1"/>
     <w:multiLevelType w:val="hybridMultilevel"/>
     <w:tmpl w:val="BD32DC78"/>
@@ -5624,7 +6382,7 @@
       </w:rPr>
     </w:lvl>
   </w:abstractNum>
-  <w:abstractNum w:abstractNumId="12" w15:restartNumberingAfterBreak="0">
+  <w:abstractNum w:abstractNumId="13" w15:restartNumberingAfterBreak="0">
     <w:nsid w:val="7C6B585B"/>
     <w:multiLevelType w:val="multilevel"/>
     <w:tmpl w:val="DDD4AFDE"/>
@@ -5780,10 +6538,10 @@
     <w:abstractNumId w:val="5"/>
   </w:num>
   <w:num w:numId="3" w16cid:durableId="28921787">
-    <w:abstractNumId w:val="9"/>
+    <w:abstractNumId w:val="10"/>
   </w:num>
   <w:num w:numId="4" w16cid:durableId="2097941573">
-    <w:abstractNumId w:val="12"/>
+    <w:abstractNumId w:val="13"/>
     <w:lvlOverride w:ilvl="0">
       <w:lvl w:ilvl="0">
         <w:numFmt w:val="bullet"/>
@@ -5806,19 +6564,19 @@
     <w:abstractNumId w:val="3"/>
   </w:num>
   <w:num w:numId="6" w16cid:durableId="1886596072">
-    <w:abstractNumId w:val="10"/>
+    <w:abstractNumId w:val="11"/>
   </w:num>
   <w:num w:numId="7" w16cid:durableId="333000878">
-    <w:abstractNumId w:val="6"/>
+    <w:abstractNumId w:val="7"/>
   </w:num>
   <w:num w:numId="8" w16cid:durableId="692388340">
-    <w:abstractNumId w:val="11"/>
+    <w:abstractNumId w:val="12"/>
   </w:num>
   <w:num w:numId="9" w16cid:durableId="52775287">
-    <w:abstractNumId w:val="7"/>
+    <w:abstractNumId w:val="8"/>
   </w:num>
   <w:num w:numId="10" w16cid:durableId="849295123">
-    <w:abstractNumId w:val="8"/>
+    <w:abstractNumId w:val="9"/>
   </w:num>
   <w:num w:numId="11" w16cid:durableId="1861310292">
     <w:abstractNumId w:val="2"/>
@@ -5828,6 +6586,9 @@
   </w:num>
   <w:num w:numId="13" w16cid:durableId="1720588989">
     <w:abstractNumId w:val="1"/>
+  </w:num>
+  <w:num w:numId="14" w16cid:durableId="815340613">
+    <w:abstractNumId w:val="6"/>
   </w:num>
 </w:numbering>
 </file>
@@ -6439,6 +7200,7 @@
   <w:style w:type="character" w:default="1" w:styleId="DefaultParagraphFont">
     <w:name w:val="Default Paragraph Font"/>
     <w:uiPriority w:val="1"/>
+    <w:semiHidden/>
     <w:unhideWhenUsed/>
   </w:style>
   <w:style w:type="table" w:default="1" w:styleId="TableNormal">

</xml_diff>